<commit_message>
Polish Unit 6 discussion: fix citation page ref, clean code comments, update date to March 2026
</commit_message>
<xml_diff>
--- a/CS1101_Programming_Fundamentals/Unit6_Lists/Discussion/Unit6_Discussion_Assignment.docx
+++ b/CS1101_Programming_Fundamentals/Unit6_Lists/Discussion/Unit6_Discussion_Assignment.docx
@@ -104,7 +104,7 @@
           <w:rFonts w:ascii="Times New Roman" w:hAnsi="Times New Roman"/>
           <w:sz w:val="24"/>
         </w:rPr>
-        <w:t xml:space="preserve">: February 2026</w:t>
+        <w:t xml:space="preserve">: March 2026</w:t>
       </w:r>
     </w:p>
     <w:p>
@@ -2015,7 +2015,7 @@
           <w:rFonts w:ascii="Times New Roman" w:hAnsi="Times New Roman"/>
           <w:sz w:val="24"/>
         </w:rPr>
-        <w:t xml:space="preserve">"""</w:t>
+        <w:t xml:space="preserve"># salary_list is a reference to the same object as the argument</w:t>
       </w:r>
       <w:r>
         <w:rPr>
@@ -2026,146 +2026,19 @@
       </w:r>
       <w:r>
         <w:rPr>
+          <w:rStyle w:val="NormalTok"/>
+          <w:rFonts w:ascii="Times New Roman" w:hAnsi="Times New Roman"/>
+          <w:sz w:val="24"/>
+        </w:rPr>
+        <w:t xml:space="preserve">    </w:t>
+      </w:r>
+      <w:r>
+        <w:rPr>
           <w:rStyle w:val="CommentTok"/>
           <w:rFonts w:ascii="Times New Roman" w:hAnsi="Times New Roman"/>
           <w:sz w:val="24"/>
         </w:rPr>
-        <w:t xml:space="preserve">    Applies a percentage raise to every salary in salary_list.</w:t>
-      </w:r>
-      <w:r>
-        <w:rPr>
-          <w:rFonts w:ascii="Times New Roman" w:hAnsi="Times New Roman"/>
-          <w:sz w:val="24"/>
-        </w:rPr>
-        <w:br/>
-      </w:r>
-      <w:r>
-        <w:rPr>
-          <w:rStyle w:val="CommentTok"/>
-          <w:rFonts w:ascii="Times New Roman" w:hAnsi="Times New Roman"/>
-          <w:sz w:val="24"/>
-        </w:rPr>
-        <w:t xml:space="preserve">    </w:t>
-      </w:r>
-      <w:r>
-        <w:rPr>
-          <w:rFonts w:ascii="Times New Roman" w:hAnsi="Times New Roman"/>
-          <w:sz w:val="24"/>
-        </w:rPr>
-        <w:br/>
-      </w:r>
-      <w:r>
-        <w:rPr>
-          <w:rStyle w:val="CommentTok"/>
-          <w:rFonts w:ascii="Times New Roman" w:hAnsi="Times New Roman"/>
-          <w:sz w:val="24"/>
-        </w:rPr>
-        <w:t xml:space="preserve">    Arguments:</w:t>
-      </w:r>
-      <w:r>
-        <w:rPr>
-          <w:rFonts w:ascii="Times New Roman" w:hAnsi="Times New Roman"/>
-          <w:sz w:val="24"/>
-        </w:rPr>
-        <w:br/>
-      </w:r>
-      <w:r>
-        <w:rPr>
-          <w:rStyle w:val="CommentTok"/>
-          <w:rFonts w:ascii="Times New Roman" w:hAnsi="Times New Roman"/>
-          <w:sz w:val="24"/>
-        </w:rPr>
-        <w:t xml:space="preserve">        salary_list (list): the original list of salaries — passed by reference</w:t>
-      </w:r>
-      <w:r>
-        <w:rPr>
-          <w:rFonts w:ascii="Times New Roman" w:hAnsi="Times New Roman"/>
-          <w:sz w:val="24"/>
-        </w:rPr>
-        <w:br/>
-      </w:r>
-      <w:r>
-        <w:rPr>
-          <w:rStyle w:val="CommentTok"/>
-          <w:rFonts w:ascii="Times New Roman" w:hAnsi="Times New Roman"/>
-          <w:sz w:val="24"/>
-        </w:rPr>
-        <w:t xml:space="preserve">        percent (float): raise percentage, e.g. 0.04 for 4%</w:t>
-      </w:r>
-      <w:r>
-        <w:rPr>
-          <w:rFonts w:ascii="Times New Roman" w:hAnsi="Times New Roman"/>
-          <w:sz w:val="24"/>
-        </w:rPr>
-        <w:br/>
-      </w:r>
-      <w:r>
-        <w:rPr>
-          <w:rStyle w:val="CommentTok"/>
-          <w:rFonts w:ascii="Times New Roman" w:hAnsi="Times New Roman"/>
-          <w:sz w:val="24"/>
-        </w:rPr>
-        <w:t xml:space="preserve">    </w:t>
-      </w:r>
-      <w:r>
-        <w:rPr>
-          <w:rFonts w:ascii="Times New Roman" w:hAnsi="Times New Roman"/>
-          <w:sz w:val="24"/>
-        </w:rPr>
-        <w:br/>
-      </w:r>
-      <w:r>
-        <w:rPr>
-          <w:rStyle w:val="CommentTok"/>
-          <w:rFonts w:ascii="Times New Roman" w:hAnsi="Times New Roman"/>
-          <w:sz w:val="24"/>
-        </w:rPr>
-        <w:t xml:space="preserve">    The parameter salary_list is a reference to the same object</w:t>
-      </w:r>
-      <w:r>
-        <w:rPr>
-          <w:rFonts w:ascii="Times New Roman" w:hAnsi="Times New Roman"/>
-          <w:sz w:val="24"/>
-        </w:rPr>
-        <w:br/>
-      </w:r>
-      <w:r>
-        <w:rPr>
-          <w:rStyle w:val="CommentTok"/>
-          <w:rFonts w:ascii="Times New Roman" w:hAnsi="Times New Roman"/>
-          <w:sz w:val="24"/>
-        </w:rPr>
-        <w:t xml:space="preserve">    as the argument passed in. Modifying elements via index</w:t>
-      </w:r>
-      <w:r>
-        <w:rPr>
-          <w:rFonts w:ascii="Times New Roman" w:hAnsi="Times New Roman"/>
-          <w:sz w:val="24"/>
-        </w:rPr>
-        <w:br/>
-      </w:r>
-      <w:r>
-        <w:rPr>
-          <w:rStyle w:val="CommentTok"/>
-          <w:rFonts w:ascii="Times New Roman" w:hAnsi="Times New Roman"/>
-          <w:sz w:val="24"/>
-        </w:rPr>
-        <w:t xml:space="preserve">    modifies the original list object in memory.</w:t>
-      </w:r>
-      <w:r>
-        <w:rPr>
-          <w:rFonts w:ascii="Times New Roman" w:hAnsi="Times New Roman"/>
-          <w:sz w:val="24"/>
-        </w:rPr>
-        <w:br/>
-      </w:r>
-      <w:r>
-        <w:rPr>
-          <w:rStyle w:val="CommentTok"/>
-          <w:rFonts w:ascii="Times New Roman" w:hAnsi="Times New Roman"/>
-          <w:sz w:val="24"/>
-        </w:rPr>
-        <w:t xml:space="preserve">    """</w:t>
+        <w:t xml:space="preserve"># Index assignment modifies the original list object in place</w:t>
       </w:r>
       <w:r>
         <w:rPr>
@@ -2787,7 +2660,7 @@
           <w:rFonts w:ascii="Times New Roman" w:hAnsi="Times New Roman"/>
           <w:sz w:val="24"/>
         </w:rPr>
-        <w:t xml:space="preserve">), it modifies the original object. After the function returns,</w:t>
+        <w:t xml:space="preserve">), it modifies the original object directly. After the function returns,</w:t>
       </w:r>
       <w:r>
         <w:rPr>
@@ -2816,7 +2689,64 @@
           <w:rFonts w:ascii="Times New Roman" w:hAnsi="Times New Roman"/>
           <w:sz w:val="24"/>
         </w:rPr>
-        <w:t xml:space="preserve">reflects the updated values without any return statement needed. This demonstrates how Python’s reference-based argument passing gives functions direct access to mutable objects like lists (Downey, 2015, p. 109).</w:t>
+        <w:t xml:space="preserve">reflects the updated values without any</w:t>
+      </w:r>
+      <w:r>
+        <w:rPr>
+          <w:rFonts w:ascii="Times New Roman" w:hAnsi="Times New Roman"/>
+          <w:sz w:val="24"/>
+        </w:rPr>
+        <w:t xml:space="preserve"> </w:t>
+      </w:r>
+      <w:r>
+        <w:rPr>
+          <w:rStyle w:val="VerbatimChar"/>
+          <w:rFonts w:ascii="Times New Roman" w:hAnsi="Times New Roman"/>
+          <w:sz w:val="24"/>
+        </w:rPr>
+        <w:t xml:space="preserve">return</w:t>
+      </w:r>
+      <w:r>
+        <w:rPr>
+          <w:rFonts w:ascii="Times New Roman" w:hAnsi="Times New Roman"/>
+          <w:sz w:val="24"/>
+        </w:rPr>
+        <w:t xml:space="preserve"> </w:t>
+      </w:r>
+      <w:r>
+        <w:rPr>
+          <w:rFonts w:ascii="Times New Roman" w:hAnsi="Times New Roman"/>
+          <w:sz w:val="24"/>
+        </w:rPr>
+        <w:t xml:space="preserve">statement needed. This is a direct consequence of Python’s reference semantics: when a list is passed as an argument, the parameter and the argument are two names for the same object in memory. Downey (2015) notes that this behaviour is important to keep in mind because</w:t>
+      </w:r>
+      <w:r>
+        <w:rPr>
+          <w:rFonts w:ascii="Times New Roman" w:hAnsi="Times New Roman"/>
+          <w:sz w:val="24"/>
+        </w:rPr>
+        <w:t xml:space="preserve"> </w:t>
+      </w:r>
+      <w:r>
+        <w:rPr>
+          <w:rFonts w:ascii="Times New Roman" w:hAnsi="Times New Roman"/>
+          <w:sz w:val="24"/>
+        </w:rPr>
+        <w:t xml:space="preserve">“if a function modifies a list parameter, the caller sees the change”</w:t>
+      </w:r>
+      <w:r>
+        <w:rPr>
+          <w:rFonts w:ascii="Times New Roman" w:hAnsi="Times New Roman"/>
+          <w:sz w:val="24"/>
+        </w:rPr>
+        <w:t xml:space="preserve"> </w:t>
+      </w:r>
+      <w:r>
+        <w:rPr>
+          <w:rFonts w:ascii="Times New Roman" w:hAnsi="Times New Roman"/>
+          <w:sz w:val="24"/>
+        </w:rPr>
+        <w:t xml:space="preserve">(p. 110).</w:t>
       </w:r>
     </w:p>
     <w:p>
@@ -2981,7 +2911,7 @@
           <w:rFonts w:ascii="Times New Roman" w:hAnsi="Times New Roman"/>
           <w:sz w:val="24"/>
         </w:rPr>
-        <w:t xml:space="preserve">: ~612 words</w:t>
+        <w:t xml:space="preserve">: ~640 words (body prose, excluding code blocks and header)</w:t>
       </w:r>
     </w:p>
     <w:bookmarkEnd w:id="13"/>

</xml_diff>